<commit_message>
Lab1 reports change and scripts change
</commit_message>
<xml_diff>
--- a/Отчет лаб. работа№2.docx
+++ b/Отчет лаб. работа№2.docx
@@ -343,8 +343,8 @@
       <w:tblGrid>
         <w:gridCol w:w="4248"/>
         <w:gridCol w:w="267"/>
-        <w:gridCol w:w="2257"/>
-        <w:gridCol w:w="2257"/>
+        <w:gridCol w:w="1985"/>
+        <w:gridCol w:w="2529"/>
       </w:tblGrid>
       <w:tr>
         <w:trPr>
@@ -391,7 +391,7 @@
         </w:tc>
         <w:tc>
           <w:tcPr>
-            <w:tcW w:w="2257" w:type="dxa"/>
+            <w:tcW w:w="1985" w:type="dxa"/>
             <w:shd w:val="clear" w:color="auto" w:fill="auto"/>
             <w:tcMar>
               <w:top w:w="100" w:type="dxa"/>
@@ -411,7 +411,7 @@
         </w:tc>
         <w:tc>
           <w:tcPr>
-            <w:tcW w:w="2257" w:type="dxa"/>
+            <w:tcW w:w="2529" w:type="dxa"/>
             <w:shd w:val="clear" w:color="auto" w:fill="auto"/>
             <w:tcMar>
               <w:top w:w="100" w:type="dxa"/>
@@ -479,7 +479,7 @@
         </w:tc>
         <w:tc>
           <w:tcPr>
-            <w:tcW w:w="2257" w:type="dxa"/>
+            <w:tcW w:w="1985" w:type="dxa"/>
             <w:shd w:val="clear" w:color="auto" w:fill="auto"/>
             <w:tcMar>
               <w:top w:w="100" w:type="dxa"/>
@@ -498,7 +498,7 @@
         </w:tc>
         <w:tc>
           <w:tcPr>
-            <w:tcW w:w="2257" w:type="dxa"/>
+            <w:tcW w:w="2529" w:type="dxa"/>
             <w:shd w:val="clear" w:color="auto" w:fill="auto"/>
             <w:tcMar>
               <w:top w:w="100" w:type="dxa"/>
@@ -586,7 +586,7 @@
         </w:tc>
         <w:tc>
           <w:tcPr>
-            <w:tcW w:w="2257" w:type="dxa"/>
+            <w:tcW w:w="1985" w:type="dxa"/>
             <w:shd w:val="clear" w:color="auto" w:fill="auto"/>
             <w:tcMar>
               <w:top w:w="100" w:type="dxa"/>
@@ -605,7 +605,7 @@
         </w:tc>
         <w:tc>
           <w:tcPr>
-            <w:tcW w:w="2257" w:type="dxa"/>
+            <w:tcW w:w="2529" w:type="dxa"/>
             <w:shd w:val="clear" w:color="auto" w:fill="auto"/>
             <w:tcMar>
               <w:top w:w="100" w:type="dxa"/>
@@ -662,7 +662,7 @@
     </w:p>
     <w:p>
       <w:pPr>
-        <w:jc w:val="center"/>
+        <w:ind w:firstLine="0"/>
         <w:rPr>
           <w:rFonts w:cs="Times New Roman"/>
           <w:szCs w:val="28"/>
@@ -671,7 +671,7 @@
     </w:p>
     <w:p>
       <w:pPr>
-        <w:jc w:val="center"/>
+        <w:ind w:firstLine="0"/>
         <w:rPr>
           <w:rFonts w:cs="Times New Roman"/>
           <w:szCs w:val="28"/>
@@ -1716,6 +1716,69 @@
         </w:rPr>
         <w:t xml:space="preserve"> Изучение сигналов при помощи анализа спектра.</w:t>
       </w:r>
+      <w:r>
+        <w:rPr>
+          <w:rFonts w:ascii="TimesNewRomanPSMT" w:eastAsia="Times New Roman" w:hAnsi="TimesNewRomanPSMT" w:cs="Times New Roman"/>
+          <w:color w:val="000000"/>
+        </w:rPr>
+        <w:t xml:space="preserve"> Научиться применять функции из пакетов</w:t>
+      </w:r>
+      <w:r>
+        <w:rPr>
+          <w:rFonts w:ascii="TimesNewRomanPSMT" w:eastAsia="Times New Roman" w:hAnsi="TimesNewRomanPSMT" w:cs="Times New Roman"/>
+          <w:color w:val="000000"/>
+        </w:rPr>
+        <w:t xml:space="preserve"> </w:t>
+      </w:r>
+      <w:proofErr w:type="spellStart"/>
+      <w:r>
+        <w:rPr>
+          <w:rFonts w:ascii="TimesNewRomanPSMT" w:eastAsia="Times New Roman" w:hAnsi="TimesNewRomanPSMT" w:cs="Times New Roman"/>
+          <w:color w:val="000000"/>
+        </w:rPr>
+        <w:t>np</w:t>
+      </w:r>
+      <w:proofErr w:type="spellEnd"/>
+      <w:r>
+        <w:rPr>
+          <w:rFonts w:ascii="TimesNewRomanPSMT" w:eastAsia="Times New Roman" w:hAnsi="TimesNewRomanPSMT" w:cs="Times New Roman"/>
+          <w:color w:val="000000"/>
+        </w:rPr>
+        <w:t xml:space="preserve">, </w:t>
+      </w:r>
+      <w:proofErr w:type="spellStart"/>
+      <w:r>
+        <w:rPr>
+          <w:rFonts w:ascii="TimesNewRomanPSMT" w:eastAsia="Times New Roman" w:hAnsi="TimesNewRomanPSMT" w:cs="Times New Roman"/>
+          <w:color w:val="000000"/>
+        </w:rPr>
+        <w:t>matplotlib</w:t>
+      </w:r>
+      <w:proofErr w:type="spellEnd"/>
+      <w:r>
+        <w:rPr>
+          <w:rFonts w:ascii="TimesNewRomanPSMT" w:eastAsia="Times New Roman" w:hAnsi="TimesNewRomanPSMT" w:cs="Times New Roman"/>
+          <w:color w:val="000000"/>
+        </w:rPr>
+        <w:t xml:space="preserve">, </w:t>
+      </w:r>
+      <w:proofErr w:type="spellStart"/>
+      <w:r>
+        <w:rPr>
+          <w:rFonts w:ascii="TimesNewRomanPSMT" w:eastAsia="Times New Roman" w:hAnsi="TimesNewRomanPSMT" w:cs="Times New Roman"/>
+          <w:color w:val="000000"/>
+          <w:lang w:val="en-US"/>
+        </w:rPr>
+        <w:t>scipy</w:t>
+      </w:r>
+      <w:proofErr w:type="spellEnd"/>
+      <w:r>
+        <w:rPr>
+          <w:rFonts w:ascii="TimesNewRomanPSMT" w:eastAsia="Times New Roman" w:hAnsi="TimesNewRomanPSMT" w:cs="Times New Roman"/>
+          <w:color w:val="000000"/>
+        </w:rPr>
+        <w:t>.</w:t>
+      </w:r>
     </w:p>
     <w:p>
       <w:pPr>
@@ -1746,19 +1809,7 @@
         <w:rPr>
           <w:color w:val="000000"/>
         </w:rPr>
-        <w:t>Разработа</w:t>
-      </w:r>
-      <w:r>
-        <w:rPr>
-          <w:color w:val="000000"/>
-        </w:rPr>
-        <w:t>ть</w:t>
-      </w:r>
-      <w:r>
-        <w:rPr>
-          <w:color w:val="000000"/>
-        </w:rPr>
-        <w:t xml:space="preserve"> программу для построения графика дискретной последовательности по своему варианту, амплитуды ее спектра, фазы спектра, мнимой и действительной частей спектра.</w:t>
+        <w:t>Разработать программу для построения графика дискретной последовательности по своему варианту, амплитуды ее спектра, фазы спектра, мнимой и действительной частей спектра.</w:t>
       </w:r>
     </w:p>
     <w:p>
@@ -2061,55 +2112,7 @@
         <w:rPr>
           <w:color w:val="000000"/>
         </w:rPr>
-        <w:t>Добав</w:t>
-      </w:r>
-      <w:r>
-        <w:rPr>
-          <w:color w:val="000000"/>
-        </w:rPr>
-        <w:t>ить</w:t>
-      </w:r>
-      <w:r>
-        <w:rPr>
-          <w:color w:val="000000"/>
-        </w:rPr>
-        <w:t xml:space="preserve"> код построения амплитуды спектра суммы гармонических сигналов с частотами</w:t>
-      </w:r>
-      <w:r>
-        <w:rPr>
-          <w:color w:val="000000"/>
-        </w:rPr>
-        <w:t>,</w:t>
-      </w:r>
-      <w:r>
-        <w:rPr>
-          <w:color w:val="000000"/>
-        </w:rPr>
-        <w:t xml:space="preserve"> </w:t>
-      </w:r>
-      <w:r>
-        <w:rPr>
-          <w:color w:val="000000"/>
-        </w:rPr>
-        <w:t>представленными в таблице</w:t>
-      </w:r>
-      <w:r>
-        <w:rPr>
-          <w:color w:val="000000"/>
-        </w:rPr>
-        <w:t>, амплитуды составляющих выбр</w:t>
-      </w:r>
-      <w:r>
-        <w:rPr>
-          <w:color w:val="000000"/>
-        </w:rPr>
-        <w:t>ать</w:t>
-      </w:r>
-      <w:r>
-        <w:rPr>
-          <w:color w:val="000000"/>
-        </w:rPr>
-        <w:t xml:space="preserve"> произвольными натуральными числами</w:t>
+        <w:t>Добавить код построения амплитуды спектра суммы гармонических сигналов с частотами, представленными в таблице, амплитуды составляющих выбрать произвольными натуральными числами</w:t>
       </w:r>
       <w:r>
         <w:t>.</w:t>
@@ -2156,6 +2159,1340 @@
     </w:p>
     <w:p>
       <w:pPr>
+        <w:pBdr>
+          <w:top w:val="single" w:sz="4" w:space="1" w:color="auto"/>
+          <w:left w:val="single" w:sz="4" w:space="4" w:color="auto"/>
+          <w:bottom w:val="single" w:sz="4" w:space="1" w:color="auto"/>
+          <w:right w:val="single" w:sz="4" w:space="4" w:color="auto"/>
+        </w:pBdr>
+        <w:suppressAutoHyphens w:val="0"/>
+        <w:autoSpaceDE w:val="0"/>
+        <w:autoSpaceDN w:val="0"/>
+        <w:adjustRightInd w:val="0"/>
+        <w:spacing w:line="240" w:lineRule="auto"/>
+        <w:ind w:firstLine="0"/>
+        <w:jc w:val="left"/>
+        <w:rPr>
+          <w:rFonts w:ascii="Courier New" w:hAnsi="Courier New" w:cs="Courier New"/>
+          <w:color w:val="000000"/>
+          <w:sz w:val="20"/>
+          <w:szCs w:val="20"/>
+          <w:highlight w:val="white"/>
+        </w:rPr>
+      </w:pPr>
+      <w:proofErr w:type="spellStart"/>
+      <w:r>
+        <w:rPr>
+          <w:rFonts w:ascii="Courier New" w:hAnsi="Courier New" w:cs="Courier New"/>
+          <w:color w:val="000000"/>
+          <w:sz w:val="20"/>
+          <w:szCs w:val="20"/>
+          <w:highlight w:val="white"/>
+        </w:rPr>
+        <w:t>plt</w:t>
+      </w:r>
+      <w:r>
+        <w:rPr>
+          <w:rFonts w:ascii="Courier New" w:hAnsi="Courier New" w:cs="Courier New"/>
+          <w:b/>
+          <w:bCs/>
+          <w:color w:val="000080"/>
+          <w:sz w:val="20"/>
+          <w:szCs w:val="20"/>
+          <w:highlight w:val="white"/>
+        </w:rPr>
+        <w:t>.</w:t>
+      </w:r>
+      <w:r>
+        <w:rPr>
+          <w:rFonts w:ascii="Courier New" w:hAnsi="Courier New" w:cs="Courier New"/>
+          <w:color w:val="000000"/>
+          <w:sz w:val="20"/>
+          <w:szCs w:val="20"/>
+          <w:highlight w:val="white"/>
+        </w:rPr>
+        <w:t>figure</w:t>
+      </w:r>
+      <w:proofErr w:type="spellEnd"/>
+      <w:r>
+        <w:rPr>
+          <w:rFonts w:ascii="Courier New" w:hAnsi="Courier New" w:cs="Courier New"/>
+          <w:b/>
+          <w:bCs/>
+          <w:color w:val="000080"/>
+          <w:sz w:val="20"/>
+          <w:szCs w:val="20"/>
+          <w:highlight w:val="white"/>
+        </w:rPr>
+        <w:t>(</w:t>
+      </w:r>
+      <w:r>
+        <w:rPr>
+          <w:rFonts w:ascii="Courier New" w:hAnsi="Courier New" w:cs="Courier New"/>
+          <w:color w:val="808080"/>
+          <w:sz w:val="20"/>
+          <w:szCs w:val="20"/>
+          <w:highlight w:val="white"/>
+        </w:rPr>
+        <w:t>'Гармоники'</w:t>
+      </w:r>
+      <w:r>
+        <w:rPr>
+          <w:rFonts w:ascii="Courier New" w:hAnsi="Courier New" w:cs="Courier New"/>
+          <w:b/>
+          <w:bCs/>
+          <w:color w:val="000080"/>
+          <w:sz w:val="20"/>
+          <w:szCs w:val="20"/>
+          <w:highlight w:val="white"/>
+        </w:rPr>
+        <w:t>)</w:t>
+      </w:r>
+    </w:p>
+    <w:p>
+      <w:pPr>
+        <w:pBdr>
+          <w:top w:val="single" w:sz="4" w:space="1" w:color="auto"/>
+          <w:left w:val="single" w:sz="4" w:space="4" w:color="auto"/>
+          <w:bottom w:val="single" w:sz="4" w:space="1" w:color="auto"/>
+          <w:right w:val="single" w:sz="4" w:space="4" w:color="auto"/>
+        </w:pBdr>
+        <w:suppressAutoHyphens w:val="0"/>
+        <w:autoSpaceDE w:val="0"/>
+        <w:autoSpaceDN w:val="0"/>
+        <w:adjustRightInd w:val="0"/>
+        <w:spacing w:line="240" w:lineRule="auto"/>
+        <w:ind w:firstLine="0"/>
+        <w:jc w:val="left"/>
+        <w:rPr>
+          <w:rFonts w:ascii="Courier New" w:hAnsi="Courier New" w:cs="Courier New"/>
+          <w:color w:val="000000"/>
+          <w:sz w:val="20"/>
+          <w:szCs w:val="20"/>
+          <w:highlight w:val="white"/>
+        </w:rPr>
+      </w:pPr>
+      <w:proofErr w:type="spellStart"/>
+      <w:r>
+        <w:rPr>
+          <w:rFonts w:ascii="Courier New" w:hAnsi="Courier New" w:cs="Courier New"/>
+          <w:color w:val="000000"/>
+          <w:sz w:val="20"/>
+          <w:szCs w:val="20"/>
+          <w:highlight w:val="white"/>
+        </w:rPr>
+        <w:t>sri</w:t>
+      </w:r>
+      <w:proofErr w:type="spellEnd"/>
+      <w:r>
+        <w:rPr>
+          <w:rFonts w:ascii="Courier New" w:hAnsi="Courier New" w:cs="Courier New"/>
+          <w:b/>
+          <w:bCs/>
+          <w:color w:val="000080"/>
+          <w:sz w:val="20"/>
+          <w:szCs w:val="20"/>
+          <w:highlight w:val="white"/>
+        </w:rPr>
+        <w:t>([</w:t>
+      </w:r>
+      <w:r>
+        <w:rPr>
+          <w:rFonts w:ascii="Courier New" w:hAnsi="Courier New" w:cs="Courier New"/>
+          <w:color w:val="FF0000"/>
+          <w:sz w:val="20"/>
+          <w:szCs w:val="20"/>
+          <w:highlight w:val="white"/>
+        </w:rPr>
+        <w:t>0</w:t>
+      </w:r>
+      <w:r>
+        <w:rPr>
+          <w:rFonts w:ascii="Courier New" w:hAnsi="Courier New" w:cs="Courier New"/>
+          <w:b/>
+          <w:bCs/>
+          <w:color w:val="000080"/>
+          <w:sz w:val="20"/>
+          <w:szCs w:val="20"/>
+          <w:highlight w:val="white"/>
+        </w:rPr>
+        <w:t>],</w:t>
+      </w:r>
+      <w:r>
+        <w:rPr>
+          <w:rFonts w:ascii="Courier New" w:hAnsi="Courier New" w:cs="Courier New"/>
+          <w:color w:val="000000"/>
+          <w:sz w:val="20"/>
+          <w:szCs w:val="20"/>
+          <w:highlight w:val="white"/>
+        </w:rPr>
+        <w:t xml:space="preserve"> </w:t>
+      </w:r>
+      <w:r>
+        <w:rPr>
+          <w:rFonts w:ascii="Courier New" w:hAnsi="Courier New" w:cs="Courier New"/>
+          <w:color w:val="FF0000"/>
+          <w:sz w:val="20"/>
+          <w:szCs w:val="20"/>
+          <w:highlight w:val="white"/>
+        </w:rPr>
+        <w:t>1</w:t>
+      </w:r>
+      <w:r>
+        <w:rPr>
+          <w:rFonts w:ascii="Courier New" w:hAnsi="Courier New" w:cs="Courier New"/>
+          <w:b/>
+          <w:bCs/>
+          <w:color w:val="000080"/>
+          <w:sz w:val="20"/>
+          <w:szCs w:val="20"/>
+          <w:highlight w:val="white"/>
+        </w:rPr>
+        <w:t>,</w:t>
+      </w:r>
+      <w:r>
+        <w:rPr>
+          <w:rFonts w:ascii="Courier New" w:hAnsi="Courier New" w:cs="Courier New"/>
+          <w:color w:val="000000"/>
+          <w:sz w:val="20"/>
+          <w:szCs w:val="20"/>
+          <w:highlight w:val="white"/>
+        </w:rPr>
+        <w:t xml:space="preserve"> </w:t>
+      </w:r>
+      <w:r>
+        <w:rPr>
+          <w:rFonts w:ascii="Courier New" w:hAnsi="Courier New" w:cs="Courier New"/>
+          <w:b/>
+          <w:bCs/>
+          <w:color w:val="000080"/>
+          <w:sz w:val="20"/>
+          <w:szCs w:val="20"/>
+          <w:highlight w:val="white"/>
+        </w:rPr>
+        <w:t>[</w:t>
+      </w:r>
+      <w:r>
+        <w:rPr>
+          <w:rFonts w:ascii="Courier New" w:hAnsi="Courier New" w:cs="Courier New"/>
+          <w:color w:val="FF0000"/>
+          <w:sz w:val="20"/>
+          <w:szCs w:val="20"/>
+          <w:highlight w:val="white"/>
+        </w:rPr>
+        <w:t>1</w:t>
+      </w:r>
+      <w:r>
+        <w:rPr>
+          <w:rFonts w:ascii="Courier New" w:hAnsi="Courier New" w:cs="Courier New"/>
+          <w:b/>
+          <w:bCs/>
+          <w:color w:val="000080"/>
+          <w:sz w:val="20"/>
+          <w:szCs w:val="20"/>
+          <w:highlight w:val="white"/>
+        </w:rPr>
+        <w:t>])</w:t>
+      </w:r>
+    </w:p>
+    <w:p>
+      <w:pPr>
+        <w:pBdr>
+          <w:top w:val="single" w:sz="4" w:space="1" w:color="auto"/>
+          <w:left w:val="single" w:sz="4" w:space="4" w:color="auto"/>
+          <w:bottom w:val="single" w:sz="4" w:space="1" w:color="auto"/>
+          <w:right w:val="single" w:sz="4" w:space="4" w:color="auto"/>
+        </w:pBdr>
+        <w:suppressAutoHyphens w:val="0"/>
+        <w:autoSpaceDE w:val="0"/>
+        <w:autoSpaceDN w:val="0"/>
+        <w:adjustRightInd w:val="0"/>
+        <w:spacing w:line="240" w:lineRule="auto"/>
+        <w:ind w:firstLine="0"/>
+        <w:jc w:val="left"/>
+        <w:rPr>
+          <w:rFonts w:ascii="Courier New" w:hAnsi="Courier New" w:cs="Courier New"/>
+          <w:color w:val="000000"/>
+          <w:sz w:val="20"/>
+          <w:szCs w:val="20"/>
+          <w:highlight w:val="white"/>
+        </w:rPr>
+      </w:pPr>
+      <w:proofErr w:type="spellStart"/>
+      <w:r>
+        <w:rPr>
+          <w:rFonts w:ascii="Courier New" w:hAnsi="Courier New" w:cs="Courier New"/>
+          <w:color w:val="000000"/>
+          <w:sz w:val="20"/>
+          <w:szCs w:val="20"/>
+          <w:highlight w:val="white"/>
+        </w:rPr>
+        <w:t>sri</w:t>
+      </w:r>
+      <w:proofErr w:type="spellEnd"/>
+      <w:r>
+        <w:rPr>
+          <w:rFonts w:ascii="Courier New" w:hAnsi="Courier New" w:cs="Courier New"/>
+          <w:b/>
+          <w:bCs/>
+          <w:color w:val="000080"/>
+          <w:sz w:val="20"/>
+          <w:szCs w:val="20"/>
+          <w:highlight w:val="white"/>
+        </w:rPr>
+        <w:t>([</w:t>
+      </w:r>
+      <w:r>
+        <w:rPr>
+          <w:rFonts w:ascii="Courier New" w:hAnsi="Courier New" w:cs="Courier New"/>
+          <w:color w:val="FF0000"/>
+          <w:sz w:val="20"/>
+          <w:szCs w:val="20"/>
+          <w:highlight w:val="white"/>
+        </w:rPr>
+        <w:t>2</w:t>
+      </w:r>
+      <w:r>
+        <w:rPr>
+          <w:rFonts w:ascii="Courier New" w:hAnsi="Courier New" w:cs="Courier New"/>
+          <w:b/>
+          <w:bCs/>
+          <w:color w:val="000080"/>
+          <w:sz w:val="20"/>
+          <w:szCs w:val="20"/>
+          <w:highlight w:val="white"/>
+        </w:rPr>
+        <w:t>],</w:t>
+      </w:r>
+      <w:r>
+        <w:rPr>
+          <w:rFonts w:ascii="Courier New" w:hAnsi="Courier New" w:cs="Courier New"/>
+          <w:color w:val="000000"/>
+          <w:sz w:val="20"/>
+          <w:szCs w:val="20"/>
+          <w:highlight w:val="white"/>
+        </w:rPr>
+        <w:t xml:space="preserve"> </w:t>
+      </w:r>
+      <w:r>
+        <w:rPr>
+          <w:rFonts w:ascii="Courier New" w:hAnsi="Courier New" w:cs="Courier New"/>
+          <w:color w:val="FF0000"/>
+          <w:sz w:val="20"/>
+          <w:szCs w:val="20"/>
+          <w:highlight w:val="white"/>
+        </w:rPr>
+        <w:t>4</w:t>
+      </w:r>
+      <w:r>
+        <w:rPr>
+          <w:rFonts w:ascii="Courier New" w:hAnsi="Courier New" w:cs="Courier New"/>
+          <w:b/>
+          <w:bCs/>
+          <w:color w:val="000080"/>
+          <w:sz w:val="20"/>
+          <w:szCs w:val="20"/>
+          <w:highlight w:val="white"/>
+        </w:rPr>
+        <w:t>,</w:t>
+      </w:r>
+      <w:r>
+        <w:rPr>
+          <w:rFonts w:ascii="Courier New" w:hAnsi="Courier New" w:cs="Courier New"/>
+          <w:color w:val="000000"/>
+          <w:sz w:val="20"/>
+          <w:szCs w:val="20"/>
+          <w:highlight w:val="white"/>
+        </w:rPr>
+        <w:t xml:space="preserve"> </w:t>
+      </w:r>
+      <w:r>
+        <w:rPr>
+          <w:rFonts w:ascii="Courier New" w:hAnsi="Courier New" w:cs="Courier New"/>
+          <w:b/>
+          <w:bCs/>
+          <w:color w:val="000080"/>
+          <w:sz w:val="20"/>
+          <w:szCs w:val="20"/>
+          <w:highlight w:val="white"/>
+        </w:rPr>
+        <w:t>[</w:t>
+      </w:r>
+      <w:r>
+        <w:rPr>
+          <w:rFonts w:ascii="Courier New" w:hAnsi="Courier New" w:cs="Courier New"/>
+          <w:color w:val="FF0000"/>
+          <w:sz w:val="20"/>
+          <w:szCs w:val="20"/>
+          <w:highlight w:val="white"/>
+        </w:rPr>
+        <w:t>1</w:t>
+      </w:r>
+      <w:r>
+        <w:rPr>
+          <w:rFonts w:ascii="Courier New" w:hAnsi="Courier New" w:cs="Courier New"/>
+          <w:b/>
+          <w:bCs/>
+          <w:color w:val="000080"/>
+          <w:sz w:val="20"/>
+          <w:szCs w:val="20"/>
+          <w:highlight w:val="white"/>
+        </w:rPr>
+        <w:t>])</w:t>
+      </w:r>
+    </w:p>
+    <w:p>
+      <w:pPr>
+        <w:pBdr>
+          <w:top w:val="single" w:sz="4" w:space="1" w:color="auto"/>
+          <w:left w:val="single" w:sz="4" w:space="4" w:color="auto"/>
+          <w:bottom w:val="single" w:sz="4" w:space="1" w:color="auto"/>
+          <w:right w:val="single" w:sz="4" w:space="4" w:color="auto"/>
+        </w:pBdr>
+        <w:suppressAutoHyphens w:val="0"/>
+        <w:autoSpaceDE w:val="0"/>
+        <w:autoSpaceDN w:val="0"/>
+        <w:adjustRightInd w:val="0"/>
+        <w:spacing w:line="240" w:lineRule="auto"/>
+        <w:ind w:firstLine="0"/>
+        <w:jc w:val="left"/>
+        <w:rPr>
+          <w:rFonts w:ascii="Courier New" w:hAnsi="Courier New" w:cs="Courier New"/>
+          <w:color w:val="000000"/>
+          <w:sz w:val="20"/>
+          <w:szCs w:val="20"/>
+          <w:highlight w:val="white"/>
+        </w:rPr>
+      </w:pPr>
+      <w:proofErr w:type="spellStart"/>
+      <w:r>
+        <w:rPr>
+          <w:rFonts w:ascii="Courier New" w:hAnsi="Courier New" w:cs="Courier New"/>
+          <w:color w:val="000000"/>
+          <w:sz w:val="20"/>
+          <w:szCs w:val="20"/>
+          <w:highlight w:val="white"/>
+        </w:rPr>
+        <w:t>sri</w:t>
+      </w:r>
+      <w:proofErr w:type="spellEnd"/>
+      <w:r>
+        <w:rPr>
+          <w:rFonts w:ascii="Courier New" w:hAnsi="Courier New" w:cs="Courier New"/>
+          <w:b/>
+          <w:bCs/>
+          <w:color w:val="000080"/>
+          <w:sz w:val="20"/>
+          <w:szCs w:val="20"/>
+          <w:highlight w:val="white"/>
+        </w:rPr>
+        <w:t>([</w:t>
+      </w:r>
+      <w:r>
+        <w:rPr>
+          <w:rFonts w:ascii="Courier New" w:hAnsi="Courier New" w:cs="Courier New"/>
+          <w:color w:val="FF0000"/>
+          <w:sz w:val="20"/>
+          <w:szCs w:val="20"/>
+          <w:highlight w:val="white"/>
+        </w:rPr>
+        <w:t>6</w:t>
+      </w:r>
+      <w:r>
+        <w:rPr>
+          <w:rFonts w:ascii="Courier New" w:hAnsi="Courier New" w:cs="Courier New"/>
+          <w:b/>
+          <w:bCs/>
+          <w:color w:val="000080"/>
+          <w:sz w:val="20"/>
+          <w:szCs w:val="20"/>
+          <w:highlight w:val="white"/>
+        </w:rPr>
+        <w:t>],</w:t>
+      </w:r>
+      <w:r>
+        <w:rPr>
+          <w:rFonts w:ascii="Courier New" w:hAnsi="Courier New" w:cs="Courier New"/>
+          <w:color w:val="000000"/>
+          <w:sz w:val="20"/>
+          <w:szCs w:val="20"/>
+          <w:highlight w:val="white"/>
+        </w:rPr>
+        <w:t xml:space="preserve"> </w:t>
+      </w:r>
+      <w:r>
+        <w:rPr>
+          <w:rFonts w:ascii="Courier New" w:hAnsi="Courier New" w:cs="Courier New"/>
+          <w:color w:val="FF0000"/>
+          <w:sz w:val="20"/>
+          <w:szCs w:val="20"/>
+          <w:highlight w:val="white"/>
+        </w:rPr>
+        <w:t>7</w:t>
+      </w:r>
+      <w:r>
+        <w:rPr>
+          <w:rFonts w:ascii="Courier New" w:hAnsi="Courier New" w:cs="Courier New"/>
+          <w:b/>
+          <w:bCs/>
+          <w:color w:val="000080"/>
+          <w:sz w:val="20"/>
+          <w:szCs w:val="20"/>
+          <w:highlight w:val="white"/>
+        </w:rPr>
+        <w:t>,</w:t>
+      </w:r>
+      <w:r>
+        <w:rPr>
+          <w:rFonts w:ascii="Courier New" w:hAnsi="Courier New" w:cs="Courier New"/>
+          <w:color w:val="000000"/>
+          <w:sz w:val="20"/>
+          <w:szCs w:val="20"/>
+          <w:highlight w:val="white"/>
+        </w:rPr>
+        <w:t xml:space="preserve"> </w:t>
+      </w:r>
+      <w:r>
+        <w:rPr>
+          <w:rFonts w:ascii="Courier New" w:hAnsi="Courier New" w:cs="Courier New"/>
+          <w:b/>
+          <w:bCs/>
+          <w:color w:val="000080"/>
+          <w:sz w:val="20"/>
+          <w:szCs w:val="20"/>
+          <w:highlight w:val="white"/>
+        </w:rPr>
+        <w:t>[</w:t>
+      </w:r>
+      <w:r>
+        <w:rPr>
+          <w:rFonts w:ascii="Courier New" w:hAnsi="Courier New" w:cs="Courier New"/>
+          <w:color w:val="FF0000"/>
+          <w:sz w:val="20"/>
+          <w:szCs w:val="20"/>
+          <w:highlight w:val="white"/>
+        </w:rPr>
+        <w:t>1</w:t>
+      </w:r>
+      <w:r>
+        <w:rPr>
+          <w:rFonts w:ascii="Courier New" w:hAnsi="Courier New" w:cs="Courier New"/>
+          <w:b/>
+          <w:bCs/>
+          <w:color w:val="000080"/>
+          <w:sz w:val="20"/>
+          <w:szCs w:val="20"/>
+          <w:highlight w:val="white"/>
+        </w:rPr>
+        <w:t>])</w:t>
+      </w:r>
+    </w:p>
+    <w:p>
+      <w:pPr>
+        <w:pBdr>
+          <w:top w:val="single" w:sz="4" w:space="1" w:color="auto"/>
+          <w:left w:val="single" w:sz="4" w:space="4" w:color="auto"/>
+          <w:bottom w:val="single" w:sz="4" w:space="1" w:color="auto"/>
+          <w:right w:val="single" w:sz="4" w:space="4" w:color="auto"/>
+        </w:pBdr>
+        <w:suppressAutoHyphens w:val="0"/>
+        <w:autoSpaceDE w:val="0"/>
+        <w:autoSpaceDN w:val="0"/>
+        <w:adjustRightInd w:val="0"/>
+        <w:spacing w:line="240" w:lineRule="auto"/>
+        <w:ind w:firstLine="0"/>
+        <w:jc w:val="left"/>
+        <w:rPr>
+          <w:rFonts w:ascii="Courier New" w:hAnsi="Courier New" w:cs="Courier New"/>
+          <w:color w:val="000000"/>
+          <w:sz w:val="20"/>
+          <w:szCs w:val="20"/>
+          <w:highlight w:val="white"/>
+        </w:rPr>
+      </w:pPr>
+      <w:proofErr w:type="spellStart"/>
+      <w:r>
+        <w:rPr>
+          <w:rFonts w:ascii="Courier New" w:hAnsi="Courier New" w:cs="Courier New"/>
+          <w:color w:val="000000"/>
+          <w:sz w:val="20"/>
+          <w:szCs w:val="20"/>
+          <w:highlight w:val="white"/>
+        </w:rPr>
+        <w:t>sri</w:t>
+      </w:r>
+      <w:proofErr w:type="spellEnd"/>
+      <w:r>
+        <w:rPr>
+          <w:rFonts w:ascii="Courier New" w:hAnsi="Courier New" w:cs="Courier New"/>
+          <w:b/>
+          <w:bCs/>
+          <w:color w:val="000080"/>
+          <w:sz w:val="20"/>
+          <w:szCs w:val="20"/>
+          <w:highlight w:val="white"/>
+        </w:rPr>
+        <w:t>([</w:t>
+      </w:r>
+      <w:r>
+        <w:rPr>
+          <w:rFonts w:ascii="Courier New" w:hAnsi="Courier New" w:cs="Courier New"/>
+          <w:color w:val="FF0000"/>
+          <w:sz w:val="20"/>
+          <w:szCs w:val="20"/>
+          <w:highlight w:val="white"/>
+        </w:rPr>
+        <w:t>10</w:t>
+      </w:r>
+      <w:r>
+        <w:rPr>
+          <w:rFonts w:ascii="Courier New" w:hAnsi="Courier New" w:cs="Courier New"/>
+          <w:b/>
+          <w:bCs/>
+          <w:color w:val="000080"/>
+          <w:sz w:val="20"/>
+          <w:szCs w:val="20"/>
+          <w:highlight w:val="white"/>
+        </w:rPr>
+        <w:t>],</w:t>
+      </w:r>
+      <w:r>
+        <w:rPr>
+          <w:rFonts w:ascii="Courier New" w:hAnsi="Courier New" w:cs="Courier New"/>
+          <w:color w:val="000000"/>
+          <w:sz w:val="20"/>
+          <w:szCs w:val="20"/>
+          <w:highlight w:val="white"/>
+        </w:rPr>
+        <w:t xml:space="preserve"> </w:t>
+      </w:r>
+      <w:r>
+        <w:rPr>
+          <w:rFonts w:ascii="Courier New" w:hAnsi="Courier New" w:cs="Courier New"/>
+          <w:color w:val="FF0000"/>
+          <w:sz w:val="20"/>
+          <w:szCs w:val="20"/>
+          <w:highlight w:val="white"/>
+        </w:rPr>
+        <w:t>10</w:t>
+      </w:r>
+      <w:r>
+        <w:rPr>
+          <w:rFonts w:ascii="Courier New" w:hAnsi="Courier New" w:cs="Courier New"/>
+          <w:b/>
+          <w:bCs/>
+          <w:color w:val="000080"/>
+          <w:sz w:val="20"/>
+          <w:szCs w:val="20"/>
+          <w:highlight w:val="white"/>
+        </w:rPr>
+        <w:t>,</w:t>
+      </w:r>
+      <w:r>
+        <w:rPr>
+          <w:rFonts w:ascii="Courier New" w:hAnsi="Courier New" w:cs="Courier New"/>
+          <w:color w:val="000000"/>
+          <w:sz w:val="20"/>
+          <w:szCs w:val="20"/>
+          <w:highlight w:val="white"/>
+        </w:rPr>
+        <w:t xml:space="preserve"> </w:t>
+      </w:r>
+      <w:r>
+        <w:rPr>
+          <w:rFonts w:ascii="Courier New" w:hAnsi="Courier New" w:cs="Courier New"/>
+          <w:b/>
+          <w:bCs/>
+          <w:color w:val="000080"/>
+          <w:sz w:val="20"/>
+          <w:szCs w:val="20"/>
+          <w:highlight w:val="white"/>
+        </w:rPr>
+        <w:t>[</w:t>
+      </w:r>
+      <w:r>
+        <w:rPr>
+          <w:rFonts w:ascii="Courier New" w:hAnsi="Courier New" w:cs="Courier New"/>
+          <w:color w:val="FF0000"/>
+          <w:sz w:val="20"/>
+          <w:szCs w:val="20"/>
+          <w:highlight w:val="white"/>
+        </w:rPr>
+        <w:t>1</w:t>
+      </w:r>
+      <w:r>
+        <w:rPr>
+          <w:rFonts w:ascii="Courier New" w:hAnsi="Courier New" w:cs="Courier New"/>
+          <w:b/>
+          <w:bCs/>
+          <w:color w:val="000080"/>
+          <w:sz w:val="20"/>
+          <w:szCs w:val="20"/>
+          <w:highlight w:val="white"/>
+        </w:rPr>
+        <w:t>])</w:t>
+      </w:r>
+    </w:p>
+    <w:p>
+      <w:pPr>
+        <w:pBdr>
+          <w:top w:val="single" w:sz="4" w:space="1" w:color="auto"/>
+          <w:left w:val="single" w:sz="4" w:space="4" w:color="auto"/>
+          <w:bottom w:val="single" w:sz="4" w:space="1" w:color="auto"/>
+          <w:right w:val="single" w:sz="4" w:space="4" w:color="auto"/>
+        </w:pBdr>
+        <w:suppressAutoHyphens w:val="0"/>
+        <w:autoSpaceDE w:val="0"/>
+        <w:autoSpaceDN w:val="0"/>
+        <w:adjustRightInd w:val="0"/>
+        <w:spacing w:line="240" w:lineRule="auto"/>
+        <w:ind w:firstLine="0"/>
+        <w:jc w:val="left"/>
+        <w:rPr>
+          <w:rFonts w:ascii="Courier New" w:hAnsi="Courier New" w:cs="Courier New"/>
+          <w:color w:val="000000"/>
+          <w:sz w:val="20"/>
+          <w:szCs w:val="20"/>
+          <w:highlight w:val="white"/>
+        </w:rPr>
+      </w:pPr>
+    </w:p>
+    <w:p>
+      <w:pPr>
+        <w:pBdr>
+          <w:top w:val="single" w:sz="4" w:space="1" w:color="auto"/>
+          <w:left w:val="single" w:sz="4" w:space="4" w:color="auto"/>
+          <w:bottom w:val="single" w:sz="4" w:space="1" w:color="auto"/>
+          <w:right w:val="single" w:sz="4" w:space="4" w:color="auto"/>
+        </w:pBdr>
+        <w:suppressAutoHyphens w:val="0"/>
+        <w:autoSpaceDE w:val="0"/>
+        <w:autoSpaceDN w:val="0"/>
+        <w:adjustRightInd w:val="0"/>
+        <w:spacing w:line="240" w:lineRule="auto"/>
+        <w:ind w:firstLine="0"/>
+        <w:jc w:val="left"/>
+        <w:rPr>
+          <w:rFonts w:ascii="Courier New" w:hAnsi="Courier New" w:cs="Courier New"/>
+          <w:color w:val="000000"/>
+          <w:sz w:val="20"/>
+          <w:szCs w:val="20"/>
+          <w:highlight w:val="white"/>
+        </w:rPr>
+      </w:pPr>
+    </w:p>
+    <w:p>
+      <w:pPr>
+        <w:pBdr>
+          <w:top w:val="single" w:sz="4" w:space="1" w:color="auto"/>
+          <w:left w:val="single" w:sz="4" w:space="4" w:color="auto"/>
+          <w:bottom w:val="single" w:sz="4" w:space="1" w:color="auto"/>
+          <w:right w:val="single" w:sz="4" w:space="4" w:color="auto"/>
+        </w:pBdr>
+        <w:suppressAutoHyphens w:val="0"/>
+        <w:autoSpaceDE w:val="0"/>
+        <w:autoSpaceDN w:val="0"/>
+        <w:adjustRightInd w:val="0"/>
+        <w:spacing w:line="240" w:lineRule="auto"/>
+        <w:ind w:firstLine="0"/>
+        <w:jc w:val="left"/>
+        <w:rPr>
+          <w:rFonts w:ascii="Courier New" w:hAnsi="Courier New" w:cs="Courier New"/>
+          <w:color w:val="000000"/>
+          <w:sz w:val="20"/>
+          <w:szCs w:val="20"/>
+          <w:highlight w:val="white"/>
+        </w:rPr>
+      </w:pPr>
+    </w:p>
+    <w:p>
+      <w:pPr>
+        <w:pBdr>
+          <w:top w:val="single" w:sz="4" w:space="1" w:color="auto"/>
+          <w:left w:val="single" w:sz="4" w:space="4" w:color="auto"/>
+          <w:bottom w:val="single" w:sz="4" w:space="1" w:color="auto"/>
+          <w:right w:val="single" w:sz="4" w:space="4" w:color="auto"/>
+        </w:pBdr>
+        <w:suppressAutoHyphens w:val="0"/>
+        <w:autoSpaceDE w:val="0"/>
+        <w:autoSpaceDN w:val="0"/>
+        <w:adjustRightInd w:val="0"/>
+        <w:spacing w:line="240" w:lineRule="auto"/>
+        <w:ind w:firstLine="0"/>
+        <w:jc w:val="left"/>
+        <w:rPr>
+          <w:rFonts w:ascii="Courier New" w:hAnsi="Courier New" w:cs="Courier New"/>
+          <w:color w:val="000000"/>
+          <w:sz w:val="20"/>
+          <w:szCs w:val="20"/>
+          <w:highlight w:val="white"/>
+        </w:rPr>
+      </w:pPr>
+      <w:proofErr w:type="spellStart"/>
+      <w:r>
+        <w:rPr>
+          <w:rFonts w:ascii="Courier New" w:hAnsi="Courier New" w:cs="Courier New"/>
+          <w:color w:val="000000"/>
+          <w:sz w:val="20"/>
+          <w:szCs w:val="20"/>
+          <w:highlight w:val="white"/>
+        </w:rPr>
+        <w:t>col</w:t>
+      </w:r>
+      <w:proofErr w:type="spellEnd"/>
+      <w:r>
+        <w:rPr>
+          <w:rFonts w:ascii="Courier New" w:hAnsi="Courier New" w:cs="Courier New"/>
+          <w:color w:val="000000"/>
+          <w:sz w:val="20"/>
+          <w:szCs w:val="20"/>
+          <w:highlight w:val="white"/>
+        </w:rPr>
+        <w:t xml:space="preserve"> </w:t>
+      </w:r>
+      <w:r>
+        <w:rPr>
+          <w:rFonts w:ascii="Courier New" w:hAnsi="Courier New" w:cs="Courier New"/>
+          <w:b/>
+          <w:bCs/>
+          <w:color w:val="000080"/>
+          <w:sz w:val="20"/>
+          <w:szCs w:val="20"/>
+          <w:highlight w:val="white"/>
+        </w:rPr>
+        <w:t>=</w:t>
+      </w:r>
+      <w:r>
+        <w:rPr>
+          <w:rFonts w:ascii="Courier New" w:hAnsi="Courier New" w:cs="Courier New"/>
+          <w:color w:val="000000"/>
+          <w:sz w:val="20"/>
+          <w:szCs w:val="20"/>
+          <w:highlight w:val="white"/>
+        </w:rPr>
+        <w:t xml:space="preserve"> </w:t>
+      </w:r>
+      <w:r>
+        <w:rPr>
+          <w:rFonts w:ascii="Courier New" w:hAnsi="Courier New" w:cs="Courier New"/>
+          <w:color w:val="FF0000"/>
+          <w:sz w:val="20"/>
+          <w:szCs w:val="20"/>
+          <w:highlight w:val="white"/>
+        </w:rPr>
+        <w:t>3</w:t>
+      </w:r>
+    </w:p>
+    <w:p>
+      <w:pPr>
+        <w:pBdr>
+          <w:top w:val="single" w:sz="4" w:space="1" w:color="auto"/>
+          <w:left w:val="single" w:sz="4" w:space="4" w:color="auto"/>
+          <w:bottom w:val="single" w:sz="4" w:space="1" w:color="auto"/>
+          <w:right w:val="single" w:sz="4" w:space="4" w:color="auto"/>
+        </w:pBdr>
+        <w:suppressAutoHyphens w:val="0"/>
+        <w:autoSpaceDE w:val="0"/>
+        <w:autoSpaceDN w:val="0"/>
+        <w:adjustRightInd w:val="0"/>
+        <w:spacing w:line="240" w:lineRule="auto"/>
+        <w:ind w:firstLine="0"/>
+        <w:jc w:val="left"/>
+        <w:rPr>
+          <w:rFonts w:ascii="Courier New" w:hAnsi="Courier New" w:cs="Courier New"/>
+          <w:color w:val="000000"/>
+          <w:sz w:val="20"/>
+          <w:szCs w:val="20"/>
+          <w:highlight w:val="white"/>
+        </w:rPr>
+      </w:pPr>
+      <w:proofErr w:type="spellStart"/>
+      <w:r>
+        <w:rPr>
+          <w:rFonts w:ascii="Courier New" w:hAnsi="Courier New" w:cs="Courier New"/>
+          <w:color w:val="000000"/>
+          <w:sz w:val="20"/>
+          <w:szCs w:val="20"/>
+          <w:highlight w:val="white"/>
+        </w:rPr>
+        <w:t>line</w:t>
+      </w:r>
+      <w:proofErr w:type="spellEnd"/>
+      <w:r>
+        <w:rPr>
+          <w:rFonts w:ascii="Courier New" w:hAnsi="Courier New" w:cs="Courier New"/>
+          <w:color w:val="000000"/>
+          <w:sz w:val="20"/>
+          <w:szCs w:val="20"/>
+          <w:highlight w:val="white"/>
+        </w:rPr>
+        <w:t xml:space="preserve"> </w:t>
+      </w:r>
+      <w:r>
+        <w:rPr>
+          <w:rFonts w:ascii="Courier New" w:hAnsi="Courier New" w:cs="Courier New"/>
+          <w:b/>
+          <w:bCs/>
+          <w:color w:val="000080"/>
+          <w:sz w:val="20"/>
+          <w:szCs w:val="20"/>
+          <w:highlight w:val="white"/>
+        </w:rPr>
+        <w:t>=</w:t>
+      </w:r>
+      <w:r>
+        <w:rPr>
+          <w:rFonts w:ascii="Courier New" w:hAnsi="Courier New" w:cs="Courier New"/>
+          <w:color w:val="000000"/>
+          <w:sz w:val="20"/>
+          <w:szCs w:val="20"/>
+          <w:highlight w:val="white"/>
+        </w:rPr>
+        <w:t xml:space="preserve"> </w:t>
+      </w:r>
+      <w:r>
+        <w:rPr>
+          <w:rFonts w:ascii="Courier New" w:hAnsi="Courier New" w:cs="Courier New"/>
+          <w:color w:val="FF0000"/>
+          <w:sz w:val="20"/>
+          <w:szCs w:val="20"/>
+          <w:highlight w:val="white"/>
+        </w:rPr>
+        <w:t>1</w:t>
+      </w:r>
+    </w:p>
+    <w:p>
+      <w:pPr>
+        <w:pBdr>
+          <w:top w:val="single" w:sz="4" w:space="1" w:color="auto"/>
+          <w:left w:val="single" w:sz="4" w:space="4" w:color="auto"/>
+          <w:bottom w:val="single" w:sz="4" w:space="1" w:color="auto"/>
+          <w:right w:val="single" w:sz="4" w:space="4" w:color="auto"/>
+        </w:pBdr>
+        <w:suppressAutoHyphens w:val="0"/>
+        <w:autoSpaceDE w:val="0"/>
+        <w:autoSpaceDN w:val="0"/>
+        <w:adjustRightInd w:val="0"/>
+        <w:spacing w:line="240" w:lineRule="auto"/>
+        <w:ind w:firstLine="0"/>
+        <w:jc w:val="left"/>
+        <w:rPr>
+          <w:rFonts w:ascii="Courier New" w:hAnsi="Courier New" w:cs="Courier New"/>
+          <w:color w:val="000000"/>
+          <w:sz w:val="20"/>
+          <w:szCs w:val="20"/>
+          <w:highlight w:val="white"/>
+        </w:rPr>
+      </w:pPr>
+      <w:proofErr w:type="spellStart"/>
+      <w:r>
+        <w:rPr>
+          <w:rFonts w:ascii="Courier New" w:hAnsi="Courier New" w:cs="Courier New"/>
+          <w:color w:val="000000"/>
+          <w:sz w:val="20"/>
+          <w:szCs w:val="20"/>
+          <w:highlight w:val="white"/>
+        </w:rPr>
+        <w:t>plt</w:t>
+      </w:r>
+      <w:r>
+        <w:rPr>
+          <w:rFonts w:ascii="Courier New" w:hAnsi="Courier New" w:cs="Courier New"/>
+          <w:b/>
+          <w:bCs/>
+          <w:color w:val="000080"/>
+          <w:sz w:val="20"/>
+          <w:szCs w:val="20"/>
+          <w:highlight w:val="white"/>
+        </w:rPr>
+        <w:t>.</w:t>
+      </w:r>
+      <w:r>
+        <w:rPr>
+          <w:rFonts w:ascii="Courier New" w:hAnsi="Courier New" w:cs="Courier New"/>
+          <w:color w:val="000000"/>
+          <w:sz w:val="20"/>
+          <w:szCs w:val="20"/>
+          <w:highlight w:val="white"/>
+        </w:rPr>
+        <w:t>figure</w:t>
+      </w:r>
+      <w:proofErr w:type="spellEnd"/>
+      <w:r>
+        <w:rPr>
+          <w:rFonts w:ascii="Courier New" w:hAnsi="Courier New" w:cs="Courier New"/>
+          <w:b/>
+          <w:bCs/>
+          <w:color w:val="000080"/>
+          <w:sz w:val="20"/>
+          <w:szCs w:val="20"/>
+          <w:highlight w:val="white"/>
+        </w:rPr>
+        <w:t>(</w:t>
+      </w:r>
+      <w:r>
+        <w:rPr>
+          <w:rFonts w:ascii="Courier New" w:hAnsi="Courier New" w:cs="Courier New"/>
+          <w:color w:val="808080"/>
+          <w:sz w:val="20"/>
+          <w:szCs w:val="20"/>
+          <w:highlight w:val="white"/>
+        </w:rPr>
+        <w:t>'Сумма гармоник'</w:t>
+      </w:r>
+      <w:r>
+        <w:rPr>
+          <w:rFonts w:ascii="Courier New" w:hAnsi="Courier New" w:cs="Courier New"/>
+          <w:b/>
+          <w:bCs/>
+          <w:color w:val="000080"/>
+          <w:sz w:val="20"/>
+          <w:szCs w:val="20"/>
+          <w:highlight w:val="white"/>
+        </w:rPr>
+        <w:t>)</w:t>
+      </w:r>
+    </w:p>
+    <w:p>
+      <w:pPr>
+        <w:pBdr>
+          <w:top w:val="single" w:sz="4" w:space="1" w:color="auto"/>
+          <w:left w:val="single" w:sz="4" w:space="4" w:color="auto"/>
+          <w:bottom w:val="single" w:sz="4" w:space="1" w:color="auto"/>
+          <w:right w:val="single" w:sz="4" w:space="4" w:color="auto"/>
+        </w:pBdr>
+        <w:suppressAutoHyphens w:val="0"/>
+        <w:autoSpaceDE w:val="0"/>
+        <w:autoSpaceDN w:val="0"/>
+        <w:adjustRightInd w:val="0"/>
+        <w:spacing w:line="240" w:lineRule="auto"/>
+        <w:ind w:firstLine="0"/>
+        <w:jc w:val="left"/>
+        <w:rPr>
+          <w:rFonts w:ascii="Courier New" w:hAnsi="Courier New" w:cs="Courier New"/>
+          <w:color w:val="000000"/>
+          <w:sz w:val="20"/>
+          <w:szCs w:val="20"/>
+          <w:highlight w:val="white"/>
+        </w:rPr>
+      </w:pPr>
+      <w:proofErr w:type="spellStart"/>
+      <w:r>
+        <w:rPr>
+          <w:rFonts w:ascii="Courier New" w:hAnsi="Courier New" w:cs="Courier New"/>
+          <w:color w:val="000000"/>
+          <w:sz w:val="20"/>
+          <w:szCs w:val="20"/>
+          <w:highlight w:val="white"/>
+        </w:rPr>
+        <w:t>sri</w:t>
+      </w:r>
+      <w:proofErr w:type="spellEnd"/>
+      <w:r>
+        <w:rPr>
+          <w:rFonts w:ascii="Courier New" w:hAnsi="Courier New" w:cs="Courier New"/>
+          <w:b/>
+          <w:bCs/>
+          <w:color w:val="000080"/>
+          <w:sz w:val="20"/>
+          <w:szCs w:val="20"/>
+          <w:highlight w:val="white"/>
+        </w:rPr>
+        <w:t>([</w:t>
+      </w:r>
+      <w:r>
+        <w:rPr>
+          <w:rFonts w:ascii="Courier New" w:hAnsi="Courier New" w:cs="Courier New"/>
+          <w:color w:val="FF0000"/>
+          <w:sz w:val="20"/>
+          <w:szCs w:val="20"/>
+          <w:highlight w:val="white"/>
+        </w:rPr>
+        <w:t>0</w:t>
+      </w:r>
+      <w:r>
+        <w:rPr>
+          <w:rFonts w:ascii="Courier New" w:hAnsi="Courier New" w:cs="Courier New"/>
+          <w:b/>
+          <w:bCs/>
+          <w:color w:val="000080"/>
+          <w:sz w:val="20"/>
+          <w:szCs w:val="20"/>
+          <w:highlight w:val="white"/>
+        </w:rPr>
+        <w:t>,</w:t>
+      </w:r>
+      <w:r>
+        <w:rPr>
+          <w:rFonts w:ascii="Courier New" w:hAnsi="Courier New" w:cs="Courier New"/>
+          <w:color w:val="000000"/>
+          <w:sz w:val="20"/>
+          <w:szCs w:val="20"/>
+          <w:highlight w:val="white"/>
+        </w:rPr>
+        <w:t xml:space="preserve"> </w:t>
+      </w:r>
+      <w:r>
+        <w:rPr>
+          <w:rFonts w:ascii="Courier New" w:hAnsi="Courier New" w:cs="Courier New"/>
+          <w:color w:val="FF0000"/>
+          <w:sz w:val="20"/>
+          <w:szCs w:val="20"/>
+          <w:highlight w:val="white"/>
+        </w:rPr>
+        <w:t>2</w:t>
+      </w:r>
+      <w:r>
+        <w:rPr>
+          <w:rFonts w:ascii="Courier New" w:hAnsi="Courier New" w:cs="Courier New"/>
+          <w:b/>
+          <w:bCs/>
+          <w:color w:val="000080"/>
+          <w:sz w:val="20"/>
+          <w:szCs w:val="20"/>
+          <w:highlight w:val="white"/>
+        </w:rPr>
+        <w:t>,</w:t>
+      </w:r>
+      <w:r>
+        <w:rPr>
+          <w:rFonts w:ascii="Courier New" w:hAnsi="Courier New" w:cs="Courier New"/>
+          <w:color w:val="000000"/>
+          <w:sz w:val="20"/>
+          <w:szCs w:val="20"/>
+          <w:highlight w:val="white"/>
+        </w:rPr>
+        <w:t xml:space="preserve"> </w:t>
+      </w:r>
+      <w:r>
+        <w:rPr>
+          <w:rFonts w:ascii="Courier New" w:hAnsi="Courier New" w:cs="Courier New"/>
+          <w:color w:val="FF0000"/>
+          <w:sz w:val="20"/>
+          <w:szCs w:val="20"/>
+          <w:highlight w:val="white"/>
+        </w:rPr>
+        <w:t>6</w:t>
+      </w:r>
+      <w:r>
+        <w:rPr>
+          <w:rFonts w:ascii="Courier New" w:hAnsi="Courier New" w:cs="Courier New"/>
+          <w:b/>
+          <w:bCs/>
+          <w:color w:val="000080"/>
+          <w:sz w:val="20"/>
+          <w:szCs w:val="20"/>
+          <w:highlight w:val="white"/>
+        </w:rPr>
+        <w:t>,</w:t>
+      </w:r>
+      <w:r>
+        <w:rPr>
+          <w:rFonts w:ascii="Courier New" w:hAnsi="Courier New" w:cs="Courier New"/>
+          <w:color w:val="000000"/>
+          <w:sz w:val="20"/>
+          <w:szCs w:val="20"/>
+          <w:highlight w:val="white"/>
+        </w:rPr>
+        <w:t xml:space="preserve"> </w:t>
+      </w:r>
+      <w:r>
+        <w:rPr>
+          <w:rFonts w:ascii="Courier New" w:hAnsi="Courier New" w:cs="Courier New"/>
+          <w:color w:val="FF0000"/>
+          <w:sz w:val="20"/>
+          <w:szCs w:val="20"/>
+          <w:highlight w:val="white"/>
+        </w:rPr>
+        <w:t>10</w:t>
+      </w:r>
+      <w:r>
+        <w:rPr>
+          <w:rFonts w:ascii="Courier New" w:hAnsi="Courier New" w:cs="Courier New"/>
+          <w:b/>
+          <w:bCs/>
+          <w:color w:val="000080"/>
+          <w:sz w:val="20"/>
+          <w:szCs w:val="20"/>
+          <w:highlight w:val="white"/>
+        </w:rPr>
+        <w:t>],</w:t>
+      </w:r>
+      <w:r>
+        <w:rPr>
+          <w:rFonts w:ascii="Courier New" w:hAnsi="Courier New" w:cs="Courier New"/>
+          <w:color w:val="000000"/>
+          <w:sz w:val="20"/>
+          <w:szCs w:val="20"/>
+          <w:highlight w:val="white"/>
+        </w:rPr>
+        <w:t xml:space="preserve"> </w:t>
+      </w:r>
+      <w:r>
+        <w:rPr>
+          <w:rFonts w:ascii="Courier New" w:hAnsi="Courier New" w:cs="Courier New"/>
+          <w:color w:val="FF0000"/>
+          <w:sz w:val="20"/>
+          <w:szCs w:val="20"/>
+          <w:highlight w:val="white"/>
+        </w:rPr>
+        <w:t>1</w:t>
+      </w:r>
+      <w:r>
+        <w:rPr>
+          <w:rFonts w:ascii="Courier New" w:hAnsi="Courier New" w:cs="Courier New"/>
+          <w:b/>
+          <w:bCs/>
+          <w:color w:val="000080"/>
+          <w:sz w:val="20"/>
+          <w:szCs w:val="20"/>
+          <w:highlight w:val="white"/>
+        </w:rPr>
+        <w:t>,</w:t>
+      </w:r>
+      <w:r>
+        <w:rPr>
+          <w:rFonts w:ascii="Courier New" w:hAnsi="Courier New" w:cs="Courier New"/>
+          <w:color w:val="000000"/>
+          <w:sz w:val="20"/>
+          <w:szCs w:val="20"/>
+          <w:highlight w:val="white"/>
+        </w:rPr>
+        <w:t xml:space="preserve"> </w:t>
+      </w:r>
+      <w:r>
+        <w:rPr>
+          <w:rFonts w:ascii="Courier New" w:hAnsi="Courier New" w:cs="Courier New"/>
+          <w:b/>
+          <w:bCs/>
+          <w:color w:val="000080"/>
+          <w:sz w:val="20"/>
+          <w:szCs w:val="20"/>
+          <w:highlight w:val="white"/>
+        </w:rPr>
+        <w:t>[</w:t>
+      </w:r>
+      <w:r>
+        <w:rPr>
+          <w:rFonts w:ascii="Courier New" w:hAnsi="Courier New" w:cs="Courier New"/>
+          <w:color w:val="FF0000"/>
+          <w:sz w:val="20"/>
+          <w:szCs w:val="20"/>
+          <w:highlight w:val="white"/>
+        </w:rPr>
+        <w:t>1</w:t>
+      </w:r>
+      <w:r>
+        <w:rPr>
+          <w:rFonts w:ascii="Courier New" w:hAnsi="Courier New" w:cs="Courier New"/>
+          <w:b/>
+          <w:bCs/>
+          <w:color w:val="000080"/>
+          <w:sz w:val="20"/>
+          <w:szCs w:val="20"/>
+          <w:highlight w:val="white"/>
+        </w:rPr>
+        <w:t>,</w:t>
+      </w:r>
+      <w:r>
+        <w:rPr>
+          <w:rFonts w:ascii="Courier New" w:hAnsi="Courier New" w:cs="Courier New"/>
+          <w:color w:val="000000"/>
+          <w:sz w:val="20"/>
+          <w:szCs w:val="20"/>
+          <w:highlight w:val="white"/>
+        </w:rPr>
+        <w:t xml:space="preserve"> </w:t>
+      </w:r>
+      <w:r>
+        <w:rPr>
+          <w:rFonts w:ascii="Courier New" w:hAnsi="Courier New" w:cs="Courier New"/>
+          <w:color w:val="FF0000"/>
+          <w:sz w:val="20"/>
+          <w:szCs w:val="20"/>
+          <w:highlight w:val="white"/>
+        </w:rPr>
+        <w:t>4</w:t>
+      </w:r>
+      <w:r>
+        <w:rPr>
+          <w:rFonts w:ascii="Courier New" w:hAnsi="Courier New" w:cs="Courier New"/>
+          <w:b/>
+          <w:bCs/>
+          <w:color w:val="000080"/>
+          <w:sz w:val="20"/>
+          <w:szCs w:val="20"/>
+          <w:highlight w:val="white"/>
+        </w:rPr>
+        <w:t>,</w:t>
+      </w:r>
+      <w:r>
+        <w:rPr>
+          <w:rFonts w:ascii="Courier New" w:hAnsi="Courier New" w:cs="Courier New"/>
+          <w:color w:val="000000"/>
+          <w:sz w:val="20"/>
+          <w:szCs w:val="20"/>
+          <w:highlight w:val="white"/>
+        </w:rPr>
+        <w:t xml:space="preserve"> </w:t>
+      </w:r>
+      <w:r>
+        <w:rPr>
+          <w:rFonts w:ascii="Courier New" w:hAnsi="Courier New" w:cs="Courier New"/>
+          <w:color w:val="FF0000"/>
+          <w:sz w:val="20"/>
+          <w:szCs w:val="20"/>
+          <w:highlight w:val="white"/>
+        </w:rPr>
+        <w:t>7</w:t>
+      </w:r>
+      <w:r>
+        <w:rPr>
+          <w:rFonts w:ascii="Courier New" w:hAnsi="Courier New" w:cs="Courier New"/>
+          <w:b/>
+          <w:bCs/>
+          <w:color w:val="000080"/>
+          <w:sz w:val="20"/>
+          <w:szCs w:val="20"/>
+          <w:highlight w:val="white"/>
+        </w:rPr>
+        <w:t>,</w:t>
+      </w:r>
+      <w:r>
+        <w:rPr>
+          <w:rFonts w:ascii="Courier New" w:hAnsi="Courier New" w:cs="Courier New"/>
+          <w:color w:val="000000"/>
+          <w:sz w:val="20"/>
+          <w:szCs w:val="20"/>
+          <w:highlight w:val="white"/>
+        </w:rPr>
+        <w:t xml:space="preserve"> </w:t>
+      </w:r>
+      <w:r>
+        <w:rPr>
+          <w:rFonts w:ascii="Courier New" w:hAnsi="Courier New" w:cs="Courier New"/>
+          <w:color w:val="FF0000"/>
+          <w:sz w:val="20"/>
+          <w:szCs w:val="20"/>
+          <w:highlight w:val="white"/>
+        </w:rPr>
+        <w:t>2</w:t>
+      </w:r>
+      <w:r>
+        <w:rPr>
+          <w:rFonts w:ascii="Courier New" w:hAnsi="Courier New" w:cs="Courier New"/>
+          <w:b/>
+          <w:bCs/>
+          <w:color w:val="000080"/>
+          <w:sz w:val="20"/>
+          <w:szCs w:val="20"/>
+          <w:highlight w:val="white"/>
+        </w:rPr>
+        <w:t>])</w:t>
+      </w:r>
+    </w:p>
+    <w:p>
+      <w:pPr>
         <w:rPr>
           <w:rStyle w:val="Char"/>
         </w:rPr>
@@ -2203,7 +3540,6 @@
       <w:pPr>
         <w:rPr>
           <w:rStyle w:val="Char"/>
-          <w:lang w:val="en-US"/>
         </w:rPr>
       </w:pPr>
     </w:p>
@@ -2399,6 +3735,7 @@
         <w:rPr>
           <w:noProof/>
         </w:rPr>
+        <w:lastRenderedPageBreak/>
         <w:drawing>
           <wp:inline distT="0" distB="0" distL="0" distR="0" wp14:anchorId="08BBF938" wp14:editId="536C64C6">
             <wp:extent cx="5700553" cy="4032504"/>
@@ -2480,7 +3817,6 @@
       </w:pPr>
       <w:bookmarkStart w:id="21" w:name="_Toc224141519"/>
       <w:r>
-        <w:lastRenderedPageBreak/>
         <w:t xml:space="preserve">Критическое значение коэффициента </w:t>
       </w:r>
       <w:r>
@@ -2801,7 +4137,131 @@
       </w:r>
     </w:p>
     <w:p>
-      <w:pPr>
+      <w:r>
+        <w:br w:type="page"/>
+      </w:r>
+    </w:p>
+    <w:p>
+      <w:pPr>
+        <w:pStyle w:val="1"/>
+      </w:pPr>
+      <w:r>
+        <w:lastRenderedPageBreak/>
+        <w:t>Ответы на контрольные вопросы</w:t>
+      </w:r>
+    </w:p>
+    <w:p>
+      <w:pPr>
+        <w:pStyle w:val="aff6"/>
+        <w:numPr>
+          <w:ilvl w:val="0"/>
+          <w:numId w:val="22"/>
+        </w:numPr>
+      </w:pPr>
+      <w:r>
+        <w:t>Как по спектру суммы гармонических сигналов определить амплитуду каждой составляющей?</w:t>
+      </w:r>
+    </w:p>
+    <w:p>
+      <w:pPr>
+        <w:ind w:left="567" w:firstLine="0"/>
+      </w:pPr>
+    </w:p>
+    <w:p>
+      <w:pPr>
+        <w:pStyle w:val="aff6"/>
+        <w:numPr>
+          <w:ilvl w:val="0"/>
+          <w:numId w:val="22"/>
+        </w:numPr>
+      </w:pPr>
+      <w:r>
+        <w:t>Как изменится график амплитуды спектра суммы гармонических сигналов</w:t>
+      </w:r>
+      <w:r>
+        <w:t xml:space="preserve"> </w:t>
+      </w:r>
+      <w:r>
+        <w:t>при увеличении/уменьшении амплитуды одной из составляющих?</w:t>
+      </w:r>
+    </w:p>
+    <w:p>
+      <w:pPr>
+        <w:pStyle w:val="aff6"/>
+        <w:ind w:left="567" w:firstLine="0"/>
+      </w:pPr>
+    </w:p>
+    <w:p>
+      <w:pPr>
+        <w:pStyle w:val="aff6"/>
+        <w:numPr>
+          <w:ilvl w:val="0"/>
+          <w:numId w:val="22"/>
+        </w:numPr>
+      </w:pPr>
+      <w:r>
+        <w:t>Как изменится график амплитуды спектра суммы гармонических сигналов</w:t>
+      </w:r>
+      <w:r>
+        <w:t xml:space="preserve"> </w:t>
+      </w:r>
+      <w:r>
+        <w:t>при увеличении/уменьшении</w:t>
+      </w:r>
+      <w:r>
+        <w:t xml:space="preserve"> </w:t>
+      </w:r>
+      <w:r>
+        <w:t xml:space="preserve">частоты одной из составляющих? </w:t>
+      </w:r>
+    </w:p>
+    <w:p>
+      <w:pPr>
+        <w:pStyle w:val="aff6"/>
+        <w:ind w:left="567" w:firstLine="0"/>
+      </w:pPr>
+    </w:p>
+    <w:p>
+      <w:pPr>
+        <w:pStyle w:val="aff6"/>
+        <w:numPr>
+          <w:ilvl w:val="0"/>
+          <w:numId w:val="22"/>
+        </w:numPr>
+        <w:rPr>
+          <w:rFonts w:cs="Times New Roman"/>
+          <w:sz w:val="32"/>
+          <w:szCs w:val="32"/>
+        </w:rPr>
+      </w:pPr>
+      <w:r>
+        <w:t>Какие свойства дискретного преобразования Фурье были проиллюстрированы в работе? Покажите это на графиках</w:t>
+      </w:r>
+      <w:r>
+        <w:rPr>
+          <w:rFonts w:cs="Times New Roman"/>
+          <w:sz w:val="32"/>
+          <w:szCs w:val="32"/>
+        </w:rPr>
+        <w:t>.</w:t>
+      </w:r>
+    </w:p>
+    <w:p>
+      <w:pPr>
+        <w:pStyle w:val="aff6"/>
+        <w:ind w:left="567" w:firstLine="0"/>
+        <w:rPr>
+          <w:rFonts w:cs="Times New Roman"/>
+          <w:sz w:val="32"/>
+          <w:szCs w:val="32"/>
+        </w:rPr>
+      </w:pPr>
+    </w:p>
+    <w:p>
+      <w:pPr>
+        <w:spacing w:line="240" w:lineRule="auto"/>
+        <w:ind w:firstLine="0"/>
+        <w:jc w:val="left"/>
         <w:rPr>
           <w:rFonts w:cs="Times New Roman"/>
           <w:b/>
@@ -2811,6 +4271,13 @@
         </w:rPr>
       </w:pPr>
       <w:r>
+        <w:rPr>
+          <w:rFonts w:cs="Times New Roman"/>
+          <w:b/>
+          <w:bCs/>
+          <w:sz w:val="32"/>
+          <w:szCs w:val="32"/>
+        </w:rPr>
         <w:br w:type="page"/>
       </w:r>
     </w:p>
@@ -4070,6 +5537,95 @@
     </w:lvl>
   </w:abstractNum>
   <w:abstractNum w:abstractNumId="9" w15:restartNumberingAfterBreak="0">
+    <w:nsid w:val="51A32C4A"/>
+    <w:multiLevelType w:val="hybridMultilevel"/>
+    <w:tmpl w:val="FAC4F574"/>
+    <w:lvl w:ilvl="0" w:tplc="0666E398">
+      <w:start w:val="1"/>
+      <w:numFmt w:val="decimal"/>
+      <w:lvlText w:val="%1."/>
+      <w:lvlJc w:val="left"/>
+      <w:pPr>
+        <w:ind w:left="927" w:hanging="360"/>
+      </w:pPr>
+      <w:rPr>
+        <w:rFonts w:hint="default"/>
+      </w:rPr>
+    </w:lvl>
+    <w:lvl w:ilvl="1" w:tplc="04190019" w:tentative="1">
+      <w:start w:val="1"/>
+      <w:numFmt w:val="lowerLetter"/>
+      <w:lvlText w:val="%2."/>
+      <w:lvlJc w:val="left"/>
+      <w:pPr>
+        <w:ind w:left="1647" w:hanging="360"/>
+      </w:pPr>
+    </w:lvl>
+    <w:lvl w:ilvl="2" w:tplc="0419001B" w:tentative="1">
+      <w:start w:val="1"/>
+      <w:numFmt w:val="lowerRoman"/>
+      <w:lvlText w:val="%3."/>
+      <w:lvlJc w:val="right"/>
+      <w:pPr>
+        <w:ind w:left="2367" w:hanging="180"/>
+      </w:pPr>
+    </w:lvl>
+    <w:lvl w:ilvl="3" w:tplc="0419000F" w:tentative="1">
+      <w:start w:val="1"/>
+      <w:numFmt w:val="decimal"/>
+      <w:lvlText w:val="%4."/>
+      <w:lvlJc w:val="left"/>
+      <w:pPr>
+        <w:ind w:left="3087" w:hanging="360"/>
+      </w:pPr>
+    </w:lvl>
+    <w:lvl w:ilvl="4" w:tplc="04190019" w:tentative="1">
+      <w:start w:val="1"/>
+      <w:numFmt w:val="lowerLetter"/>
+      <w:lvlText w:val="%5."/>
+      <w:lvlJc w:val="left"/>
+      <w:pPr>
+        <w:ind w:left="3807" w:hanging="360"/>
+      </w:pPr>
+    </w:lvl>
+    <w:lvl w:ilvl="5" w:tplc="0419001B" w:tentative="1">
+      <w:start w:val="1"/>
+      <w:numFmt w:val="lowerRoman"/>
+      <w:lvlText w:val="%6."/>
+      <w:lvlJc w:val="right"/>
+      <w:pPr>
+        <w:ind w:left="4527" w:hanging="180"/>
+      </w:pPr>
+    </w:lvl>
+    <w:lvl w:ilvl="6" w:tplc="0419000F" w:tentative="1">
+      <w:start w:val="1"/>
+      <w:numFmt w:val="decimal"/>
+      <w:lvlText w:val="%7."/>
+      <w:lvlJc w:val="left"/>
+      <w:pPr>
+        <w:ind w:left="5247" w:hanging="360"/>
+      </w:pPr>
+    </w:lvl>
+    <w:lvl w:ilvl="7" w:tplc="04190019" w:tentative="1">
+      <w:start w:val="1"/>
+      <w:numFmt w:val="lowerLetter"/>
+      <w:lvlText w:val="%8."/>
+      <w:lvlJc w:val="left"/>
+      <w:pPr>
+        <w:ind w:left="5967" w:hanging="360"/>
+      </w:pPr>
+    </w:lvl>
+    <w:lvl w:ilvl="8" w:tplc="0419001B" w:tentative="1">
+      <w:start w:val="1"/>
+      <w:numFmt w:val="lowerRoman"/>
+      <w:lvlText w:val="%9."/>
+      <w:lvlJc w:val="right"/>
+      <w:pPr>
+        <w:ind w:left="6687" w:hanging="180"/>
+      </w:pPr>
+    </w:lvl>
+  </w:abstractNum>
+  <w:abstractNum w:abstractNumId="10" w15:restartNumberingAfterBreak="0">
     <w:nsid w:val="55421CEA"/>
     <w:multiLevelType w:val="hybridMultilevel"/>
     <w:tmpl w:val="4EC435F0"/>
@@ -4159,7 +5715,7 @@
       </w:pPr>
     </w:lvl>
   </w:abstractNum>
-  <w:abstractNum w:abstractNumId="10" w15:restartNumberingAfterBreak="0">
+  <w:abstractNum w:abstractNumId="11" w15:restartNumberingAfterBreak="0">
     <w:nsid w:val="56007BAB"/>
     <w:multiLevelType w:val="hybridMultilevel"/>
     <w:tmpl w:val="C7F8223E"/>
@@ -4248,7 +5804,7 @@
       </w:pPr>
     </w:lvl>
   </w:abstractNum>
-  <w:abstractNum w:abstractNumId="11" w15:restartNumberingAfterBreak="0">
+  <w:abstractNum w:abstractNumId="12" w15:restartNumberingAfterBreak="0">
     <w:nsid w:val="594732E4"/>
     <w:multiLevelType w:val="multilevel"/>
     <w:tmpl w:val="0A00E794"/>
@@ -4361,7 +5917,7 @@
       </w:pPr>
     </w:lvl>
   </w:abstractNum>
-  <w:abstractNum w:abstractNumId="12" w15:restartNumberingAfterBreak="0">
+  <w:abstractNum w:abstractNumId="13" w15:restartNumberingAfterBreak="0">
     <w:nsid w:val="6C6075AC"/>
     <w:multiLevelType w:val="hybridMultilevel"/>
     <w:tmpl w:val="6C324810"/>
@@ -4450,7 +6006,7 @@
       </w:pPr>
     </w:lvl>
   </w:abstractNum>
-  <w:abstractNum w:abstractNumId="13" w15:restartNumberingAfterBreak="0">
+  <w:abstractNum w:abstractNumId="14" w15:restartNumberingAfterBreak="0">
     <w:nsid w:val="71A6369B"/>
     <w:multiLevelType w:val="multilevel"/>
     <w:tmpl w:val="7418229C"/>
@@ -4577,7 +6133,7 @@
       </w:rPr>
     </w:lvl>
   </w:abstractNum>
-  <w:abstractNum w:abstractNumId="14" w15:restartNumberingAfterBreak="0">
+  <w:abstractNum w:abstractNumId="15" w15:restartNumberingAfterBreak="0">
     <w:nsid w:val="774329D9"/>
     <w:multiLevelType w:val="hybridMultilevel"/>
     <w:tmpl w:val="241C89F8"/>
@@ -4666,7 +6222,7 @@
       </w:pPr>
     </w:lvl>
   </w:abstractNum>
-  <w:abstractNum w:abstractNumId="15" w15:restartNumberingAfterBreak="0">
+  <w:abstractNum w:abstractNumId="16" w15:restartNumberingAfterBreak="0">
     <w:nsid w:val="7BDE5573"/>
     <w:multiLevelType w:val="hybridMultilevel"/>
     <w:tmpl w:val="8EBE986E"/>
@@ -4762,22 +6318,22 @@
     <w:abstractNumId w:val="2"/>
   </w:num>
   <w:num w:numId="3">
-    <w:abstractNumId w:val="12"/>
+    <w:abstractNumId w:val="13"/>
   </w:num>
   <w:num w:numId="4">
-    <w:abstractNumId w:val="10"/>
+    <w:abstractNumId w:val="11"/>
   </w:num>
   <w:num w:numId="5">
-    <w:abstractNumId w:val="13"/>
+    <w:abstractNumId w:val="14"/>
   </w:num>
   <w:num w:numId="6">
-    <w:abstractNumId w:val="9"/>
+    <w:abstractNumId w:val="10"/>
   </w:num>
   <w:num w:numId="7">
     <w:abstractNumId w:val="7"/>
   </w:num>
   <w:num w:numId="8">
-    <w:abstractNumId w:val="14"/>
+    <w:abstractNumId w:val="15"/>
   </w:num>
   <w:num w:numId="9">
     <w:abstractNumId w:val="1"/>
@@ -4786,22 +6342,22 @@
     <w:abstractNumId w:val="0"/>
   </w:num>
   <w:num w:numId="11">
-    <w:abstractNumId w:val="15"/>
+    <w:abstractNumId w:val="16"/>
   </w:num>
   <w:num w:numId="12">
     <w:abstractNumId w:val="5"/>
   </w:num>
   <w:num w:numId="13">
-    <w:abstractNumId w:val="13"/>
+    <w:abstractNumId w:val="14"/>
   </w:num>
   <w:num w:numId="14">
-    <w:abstractNumId w:val="13"/>
+    <w:abstractNumId w:val="14"/>
   </w:num>
   <w:num w:numId="15">
-    <w:abstractNumId w:val="13"/>
+    <w:abstractNumId w:val="14"/>
   </w:num>
   <w:num w:numId="16">
-    <w:abstractNumId w:val="13"/>
+    <w:abstractNumId w:val="14"/>
   </w:num>
   <w:num w:numId="17">
     <w:abstractNumId w:val="4"/>
@@ -4813,7 +6369,13 @@
     <w:abstractNumId w:val="3"/>
   </w:num>
   <w:num w:numId="20">
-    <w:abstractNumId w:val="11"/>
+    <w:abstractNumId w:val="12"/>
+  </w:num>
+  <w:num w:numId="21">
+    <w:abstractNumId w:val="14"/>
+  </w:num>
+  <w:num w:numId="22">
+    <w:abstractNumId w:val="9"/>
   </w:num>
 </w:numbering>
 </file>

</xml_diff>